<commit_message>
bai 3 kiem thu dong du lieu
</commit_message>
<xml_diff>
--- a/DaoVanDa_23021515_BaoCao_Bai2_KiemThuHopTrang.docx
+++ b/DaoVanDa_23021515_BaoCao_Bai2_KiemThuHopTrang.docx
@@ -3,20 +3,26 @@
 <w:document xmlns:wpc="http://schemas.microsoft.com/office/word/2010/wordprocessingCanvas" xmlns:cx="http://schemas.microsoft.com/office/drawing/2014/chartex" xmlns:cx1="http://schemas.microsoft.com/office/drawing/2015/9/8/chartex" xmlns:cx2="http://schemas.microsoft.com/office/drawing/2015/10/21/chartex" xmlns:cx3="http://schemas.microsoft.com/office/drawing/2016/5/9/chartex" xmlns:cx4="http://schemas.microsoft.com/office/drawing/2016/5/10/chartex" xmlns:cx5="http://schemas.microsoft.com/office/drawing/2016/5/11/chartex" xmlns:cx6="http://schemas.microsoft.com/office/drawing/2016/5/12/chartex" xmlns:cx7="http://schemas.microsoft.com/office/drawing/2016/5/13/chartex" xmlns:cx8="http://schemas.microsoft.com/office/drawing/2016/5/14/chartex" xmlns:mc="http://schemas.openxmlformats.org/markup-compatibility/2006" xmlns:aink="http://schemas.microsoft.com/office/drawing/2016/ink" xmlns:am3d="http://schemas.microsoft.com/office/drawing/2017/model3d" xmlns:o="urn:schemas-microsoft-com:office:office" xmlns:oel="http://schemas.microsoft.com/office/2019/extlst" xmlns:r="http://schemas.openxmlformats.org/officeDocument/2006/relationships" xmlns:m="http://schemas.openxmlformats.org/officeDocument/2006/math" xmlns:v="urn:schemas-microsoft-com:vml" xmlns:wp14="http://schemas.microsoft.com/office/word/2010/wordprocessingDrawing" xmlns:wp="http://schemas.openxmlformats.org/drawingml/2006/wordprocessingDrawing" xmlns:w10="urn:schemas-microsoft-com:office:word" xmlns:w="http://schemas.openxmlformats.org/wordprocessingml/2006/main" xmlns:w14="http://schemas.microsoft.com/office/word/2010/wordml" xmlns:w15="http://schemas.microsoft.com/office/word/2012/wordml" xmlns:w16cex="http://schemas.microsoft.com/office/word/2018/wordml/cex" xmlns:w16cid="http://schemas.microsoft.com/office/word/2016/wordml/cid" xmlns:w16="http://schemas.microsoft.com/office/word/2018/wordml" xmlns:w16du="http://schemas.microsoft.com/office/word/2023/wordml/word16du" xmlns:w16sdtdh="http://schemas.microsoft.com/office/word/2020/wordml/sdtdatahash" xmlns:w16sdtfl="http://schemas.microsoft.com/office/word/2024/wordml/sdtformatlock" xmlns:w16se="http://schemas.microsoft.com/office/word/2015/wordml/symex" xmlns:wpg="http://schemas.microsoft.com/office/word/2010/wordprocessingGroup" xmlns:wpi="http://schemas.microsoft.com/office/word/2010/wordprocessingInk" xmlns:wne="http://schemas.microsoft.com/office/word/2006/wordml" xmlns:wps="http://schemas.microsoft.com/office/word/2010/wordprocessingShape" mc:Ignorable="w14 w15 w16se w16cid w16 w16cex w16sdtdh w16sdtfl w16du wp14">
   <w:body>
     <w:p>
-      <w:pPr>
-        <w:spacing w:after="160"/>
-      </w:pPr>
       <w:r>
         <w:rPr>
           <w:b/>
           <w:bCs/>
         </w:rPr>
-        <w:t>BÁO CÁO KIỂM THỬ HỘP TRẮNG</w:t>
-      </w:r>
-    </w:p>
-    <w:p>
-      <w:pPr>
-        <w:spacing w:after="160"/>
+        <w:t xml:space="preserve">BÁO CÁO KIỂM THỬ HỘP </w:t>
+      </w:r>
+      <w:r>
+        <w:rPr>
+          <w:b/>
+          <w:bCs/>
+        </w:rPr>
+        <w:t>TRẮNG</w:t>
+      </w:r>
+    </w:p>
+    <w:p>
+      <w:pPr>
+        <w:rPr>
+          <w:lang w:val="vi-VN"/>
+        </w:rPr>
       </w:pPr>
       <w:r>
         <w:rPr>
@@ -25,11 +31,16 @@
         </w:rPr>
         <w:t>ĐẶC TẢ BÀI TOÁN: KIỂM TRA ĐIỀU KIỆN TUYỂN NGHĨA VỤ QUÂN SỰ</w:t>
       </w:r>
-    </w:p>
-    <w:p>
-      <w:pPr>
-        <w:spacing w:after="160"/>
-      </w:pPr>
+      <w:r>
+        <w:rPr>
+          <w:b/>
+          <w:bCs/>
+          <w:lang w:val="vi-VN"/>
+        </w:rPr>
+        <w:t xml:space="preserve"> </w:t>
+      </w:r>
+    </w:p>
+    <w:p>
       <w:r>
         <w:rPr>
           <w:i/>
@@ -40,13 +51,15 @@
     </w:p>
     <w:p>
       <w:pPr>
-        <w:spacing w:after="100"/>
-      </w:pPr>
-    </w:p>
-    <w:p>
-      <w:pPr>
-        <w:spacing w:after="160"/>
-      </w:pPr>
+        <w:tabs>
+          <w:tab w:val="left" w:pos="2289"/>
+        </w:tabs>
+      </w:pPr>
+      <w:r>
+        <w:tab/>
+      </w:r>
+    </w:p>
+    <w:p>
       <w:r>
         <w:rPr>
           <w:b/>
@@ -57,20 +70,28 @@
     </w:p>
     <w:p>
       <w:pPr>
-        <w:spacing w:after="160"/>
-      </w:pPr>
-      <w:r>
-        <w:t>Xây dựng bộ ca kiểm thử hộp trắng cho hàm check_eligibility để kiểm tra một ứng viên có đủ điều kiện nhập Nghĩa vụ Quân sự (NVQS) hay không, dựa trên 4 chỉ số: tuổi, BMI, thị lực và phân loại sức khỏe. Áp dụng kỹ thuật kiểm thử độ phủ nhánh (Branch Coverage – C2).</w:t>
-      </w:r>
-    </w:p>
-    <w:p>
-      <w:pPr>
-        <w:spacing w:after="100"/>
-      </w:pPr>
-    </w:p>
-    <w:p>
-      <w:pPr>
-        <w:spacing w:after="160"/>
+        <w:rPr>
+          <w:lang w:val="vi-VN"/>
+        </w:rPr>
+      </w:pPr>
+      <w:r>
+        <w:t>Xây dựng hàm check_eligibility để kiểm tra một ứng viên có đủ điều kiện nhập Nghĩa vụ Quân sự (NVQS) hay không, dựa trên 4 chỉ số: tuổi, BMI, thị lực và phân loại sức khỏe.</w:t>
+      </w:r>
+      <w:r>
+        <w:rPr>
+          <w:lang w:val="vi-VN"/>
+        </w:rPr>
+        <w:t xml:space="preserve"> (bài toán đã rút gọn để đơn giản hơn)</w:t>
+      </w:r>
+    </w:p>
+    <w:p/>
+    <w:p>
+      <w:pPr>
+        <w:rPr>
+          <w:b/>
+          <w:bCs/>
+          <w:lang w:val="vi-VN"/>
+        </w:rPr>
       </w:pPr>
       <w:r>
         <w:rPr>
@@ -82,17 +103,17 @@
     </w:p>
     <w:p>
       <w:pPr>
-        <w:spacing w:after="160"/>
-      </w:pPr>
+        <w:rPr>
+          <w:lang w:val="vi-VN"/>
+        </w:rPr>
+      </w:pPr>
+    </w:p>
+    <w:p>
       <w:r>
         <w:t>Hàm tiếp nhận 4 tham số đầu vào:</w:t>
       </w:r>
     </w:p>
-    <w:p>
-      <w:pPr>
-        <w:spacing w:after="100"/>
-      </w:pPr>
-    </w:p>
+    <w:p/>
     <w:tbl>
       <w:tblPr>
         <w:tblW w:w="9026" w:type="dxa"/>
@@ -111,34 +132,30 @@
         <w:tblLook w:val="04A0" w:firstRow="1" w:lastRow="0" w:firstColumn="1" w:lastColumn="0" w:noHBand="0" w:noVBand="1"/>
       </w:tblPr>
       <w:tblGrid>
-        <w:gridCol w:w="1700"/>
-        <w:gridCol w:w="900"/>
-        <w:gridCol w:w="2000"/>
-        <w:gridCol w:w="4426"/>
+        <w:gridCol w:w="1481"/>
+        <w:gridCol w:w="1191"/>
+        <w:gridCol w:w="1991"/>
+        <w:gridCol w:w="4363"/>
       </w:tblGrid>
       <w:tr>
-        <w:tblPrEx>
-          <w:tblCellMar>
-            <w:top w:w="0" w:type="dxa"/>
-            <w:bottom w:w="0" w:type="dxa"/>
-          </w:tblCellMar>
-        </w:tblPrEx>
-        <w:tc>
-          <w:tcPr>
-            <w:tcW w:w="1700" w:type="dxa"/>
-            <w:tcBorders>
-              <w:top w:val="single" w:sz="4" w:space="0" w:color="000000"/>
-              <w:left w:val="single" w:sz="4" w:space="0" w:color="000000"/>
-              <w:bottom w:val="single" w:sz="4" w:space="0" w:color="000000"/>
-              <w:right w:val="single" w:sz="4" w:space="0" w:color="000000"/>
-            </w:tcBorders>
-            <w:tcMar>
-              <w:top w:w="60" w:type="dxa"/>
-              <w:left w:w="108" w:type="dxa"/>
-              <w:bottom w:w="60" w:type="dxa"/>
-              <w:right w:w="108" w:type="dxa"/>
-            </w:tcMar>
-            <w:vAlign w:val="center"/>
+        <w:tc>
+          <w:tcPr>
+            <w:tcW w:w="1400" w:type="dxa"/>
+            <w:tcBorders>
+              <w:top w:val="single" w:sz="2" w:space="0" w:color="AAAAAA"/>
+              <w:left w:val="single" w:sz="2" w:space="0" w:color="AAAAAA"/>
+              <w:bottom w:val="single" w:sz="2" w:space="0" w:color="AAAAAA"/>
+              <w:right w:val="single" w:sz="2" w:space="0" w:color="AAAAAA"/>
+            </w:tcBorders>
+            <w:shd w:val="clear" w:color="auto" w:fill="D9D9D9"/>
+            <w:tcMar>
+              <w:top w:w="80" w:type="dxa"/>
+              <w:left w:w="120" w:type="dxa"/>
+              <w:bottom w:w="80" w:type="dxa"/>
+              <w:right w:w="120" w:type="dxa"/>
+            </w:tcMar>
+            <w:vAlign w:val="center"/>
+            <w:hideMark/>
           </w:tcPr>
           <w:p>
             <w:r>
@@ -152,20 +169,22 @@
         </w:tc>
         <w:tc>
           <w:tcPr>
-            <w:tcW w:w="900" w:type="dxa"/>
-            <w:tcBorders>
-              <w:top w:val="single" w:sz="4" w:space="0" w:color="000000"/>
-              <w:left w:val="single" w:sz="4" w:space="0" w:color="000000"/>
-              <w:bottom w:val="single" w:sz="4" w:space="0" w:color="000000"/>
-              <w:right w:val="single" w:sz="4" w:space="0" w:color="000000"/>
-            </w:tcBorders>
-            <w:tcMar>
-              <w:top w:w="60" w:type="dxa"/>
-              <w:left w:w="108" w:type="dxa"/>
-              <w:bottom w:w="60" w:type="dxa"/>
-              <w:right w:w="108" w:type="dxa"/>
-            </w:tcMar>
-            <w:vAlign w:val="center"/>
+            <w:tcW w:w="1200" w:type="dxa"/>
+            <w:tcBorders>
+              <w:top w:val="single" w:sz="2" w:space="0" w:color="AAAAAA"/>
+              <w:left w:val="single" w:sz="2" w:space="0" w:color="AAAAAA"/>
+              <w:bottom w:val="single" w:sz="2" w:space="0" w:color="AAAAAA"/>
+              <w:right w:val="single" w:sz="2" w:space="0" w:color="AAAAAA"/>
+            </w:tcBorders>
+            <w:shd w:val="clear" w:color="auto" w:fill="D9D9D9"/>
+            <w:tcMar>
+              <w:top w:w="80" w:type="dxa"/>
+              <w:left w:w="120" w:type="dxa"/>
+              <w:bottom w:w="80" w:type="dxa"/>
+              <w:right w:w="120" w:type="dxa"/>
+            </w:tcMar>
+            <w:vAlign w:val="center"/>
+            <w:hideMark/>
           </w:tcPr>
           <w:p>
             <w:r>
@@ -181,18 +200,20 @@
           <w:tcPr>
             <w:tcW w:w="2000" w:type="dxa"/>
             <w:tcBorders>
-              <w:top w:val="single" w:sz="4" w:space="0" w:color="000000"/>
-              <w:left w:val="single" w:sz="4" w:space="0" w:color="000000"/>
-              <w:bottom w:val="single" w:sz="4" w:space="0" w:color="000000"/>
-              <w:right w:val="single" w:sz="4" w:space="0" w:color="000000"/>
-            </w:tcBorders>
-            <w:tcMar>
-              <w:top w:w="60" w:type="dxa"/>
-              <w:left w:w="108" w:type="dxa"/>
-              <w:bottom w:w="60" w:type="dxa"/>
-              <w:right w:w="108" w:type="dxa"/>
-            </w:tcMar>
-            <w:vAlign w:val="center"/>
+              <w:top w:val="single" w:sz="2" w:space="0" w:color="AAAAAA"/>
+              <w:left w:val="single" w:sz="2" w:space="0" w:color="AAAAAA"/>
+              <w:bottom w:val="single" w:sz="2" w:space="0" w:color="AAAAAA"/>
+              <w:right w:val="single" w:sz="2" w:space="0" w:color="AAAAAA"/>
+            </w:tcBorders>
+            <w:shd w:val="clear" w:color="auto" w:fill="D9D9D9"/>
+            <w:tcMar>
+              <w:top w:w="80" w:type="dxa"/>
+              <w:left w:w="120" w:type="dxa"/>
+              <w:bottom w:w="80" w:type="dxa"/>
+              <w:right w:w="120" w:type="dxa"/>
+            </w:tcMar>
+            <w:vAlign w:val="center"/>
+            <w:hideMark/>
           </w:tcPr>
           <w:p>
             <w:r>
@@ -208,18 +229,20 @@
           <w:tcPr>
             <w:tcW w:w="4426" w:type="dxa"/>
             <w:tcBorders>
-              <w:top w:val="single" w:sz="4" w:space="0" w:color="000000"/>
-              <w:left w:val="single" w:sz="4" w:space="0" w:color="000000"/>
-              <w:bottom w:val="single" w:sz="4" w:space="0" w:color="000000"/>
-              <w:right w:val="single" w:sz="4" w:space="0" w:color="000000"/>
-            </w:tcBorders>
-            <w:tcMar>
-              <w:top w:w="60" w:type="dxa"/>
-              <w:left w:w="108" w:type="dxa"/>
-              <w:bottom w:w="60" w:type="dxa"/>
-              <w:right w:w="108" w:type="dxa"/>
-            </w:tcMar>
-            <w:vAlign w:val="center"/>
+              <w:top w:val="single" w:sz="2" w:space="0" w:color="AAAAAA"/>
+              <w:left w:val="single" w:sz="2" w:space="0" w:color="AAAAAA"/>
+              <w:bottom w:val="single" w:sz="2" w:space="0" w:color="AAAAAA"/>
+              <w:right w:val="single" w:sz="2" w:space="0" w:color="AAAAAA"/>
+            </w:tcBorders>
+            <w:shd w:val="clear" w:color="auto" w:fill="D9D9D9"/>
+            <w:tcMar>
+              <w:top w:w="80" w:type="dxa"/>
+              <w:left w:w="120" w:type="dxa"/>
+              <w:bottom w:w="80" w:type="dxa"/>
+              <w:right w:w="120" w:type="dxa"/>
+            </w:tcMar>
+            <w:vAlign w:val="center"/>
+            <w:hideMark/>
           </w:tcPr>
           <w:p>
             <w:r>
@@ -233,28 +256,23 @@
         </w:tc>
       </w:tr>
       <w:tr>
-        <w:tblPrEx>
-          <w:tblCellMar>
-            <w:top w:w="0" w:type="dxa"/>
-            <w:bottom w:w="0" w:type="dxa"/>
-          </w:tblCellMar>
-        </w:tblPrEx>
-        <w:tc>
-          <w:tcPr>
-            <w:tcW w:w="1700" w:type="dxa"/>
-            <w:tcBorders>
-              <w:top w:val="single" w:sz="4" w:space="0" w:color="000000"/>
-              <w:left w:val="single" w:sz="4" w:space="0" w:color="000000"/>
-              <w:bottom w:val="single" w:sz="4" w:space="0" w:color="000000"/>
-              <w:right w:val="single" w:sz="4" w:space="0" w:color="000000"/>
-            </w:tcBorders>
-            <w:tcMar>
-              <w:top w:w="60" w:type="dxa"/>
-              <w:left w:w="108" w:type="dxa"/>
-              <w:bottom w:w="60" w:type="dxa"/>
-              <w:right w:w="108" w:type="dxa"/>
-            </w:tcMar>
-            <w:vAlign w:val="center"/>
+        <w:tc>
+          <w:tcPr>
+            <w:tcW w:w="1400" w:type="dxa"/>
+            <w:tcBorders>
+              <w:top w:val="single" w:sz="2" w:space="0" w:color="AAAAAA"/>
+              <w:left w:val="single" w:sz="2" w:space="0" w:color="AAAAAA"/>
+              <w:bottom w:val="single" w:sz="2" w:space="0" w:color="AAAAAA"/>
+              <w:right w:val="single" w:sz="2" w:space="0" w:color="AAAAAA"/>
+            </w:tcBorders>
+            <w:tcMar>
+              <w:top w:w="80" w:type="dxa"/>
+              <w:left w:w="120" w:type="dxa"/>
+              <w:bottom w:w="80" w:type="dxa"/>
+              <w:right w:w="120" w:type="dxa"/>
+            </w:tcMar>
+            <w:vAlign w:val="center"/>
+            <w:hideMark/>
           </w:tcPr>
           <w:p>
             <w:r>
@@ -268,20 +286,21 @@
         </w:tc>
         <w:tc>
           <w:tcPr>
-            <w:tcW w:w="900" w:type="dxa"/>
-            <w:tcBorders>
-              <w:top w:val="single" w:sz="4" w:space="0" w:color="000000"/>
-              <w:left w:val="single" w:sz="4" w:space="0" w:color="000000"/>
-              <w:bottom w:val="single" w:sz="4" w:space="0" w:color="000000"/>
-              <w:right w:val="single" w:sz="4" w:space="0" w:color="000000"/>
-            </w:tcBorders>
-            <w:tcMar>
-              <w:top w:w="60" w:type="dxa"/>
-              <w:left w:w="108" w:type="dxa"/>
-              <w:bottom w:w="60" w:type="dxa"/>
-              <w:right w:w="108" w:type="dxa"/>
-            </w:tcMar>
-            <w:vAlign w:val="center"/>
+            <w:tcW w:w="1200" w:type="dxa"/>
+            <w:tcBorders>
+              <w:top w:val="single" w:sz="2" w:space="0" w:color="AAAAAA"/>
+              <w:left w:val="single" w:sz="2" w:space="0" w:color="AAAAAA"/>
+              <w:bottom w:val="single" w:sz="2" w:space="0" w:color="AAAAAA"/>
+              <w:right w:val="single" w:sz="2" w:space="0" w:color="AAAAAA"/>
+            </w:tcBorders>
+            <w:tcMar>
+              <w:top w:w="80" w:type="dxa"/>
+              <w:left w:w="120" w:type="dxa"/>
+              <w:bottom w:w="80" w:type="dxa"/>
+              <w:right w:w="120" w:type="dxa"/>
+            </w:tcMar>
+            <w:vAlign w:val="center"/>
+            <w:hideMark/>
           </w:tcPr>
           <w:p>
             <w:r>
@@ -293,18 +312,19 @@
           <w:tcPr>
             <w:tcW w:w="2000" w:type="dxa"/>
             <w:tcBorders>
-              <w:top w:val="single" w:sz="4" w:space="0" w:color="000000"/>
-              <w:left w:val="single" w:sz="4" w:space="0" w:color="000000"/>
-              <w:bottom w:val="single" w:sz="4" w:space="0" w:color="000000"/>
-              <w:right w:val="single" w:sz="4" w:space="0" w:color="000000"/>
-            </w:tcBorders>
-            <w:tcMar>
-              <w:top w:w="60" w:type="dxa"/>
-              <w:left w:w="108" w:type="dxa"/>
-              <w:bottom w:w="60" w:type="dxa"/>
-              <w:right w:w="108" w:type="dxa"/>
-            </w:tcMar>
-            <w:vAlign w:val="center"/>
+              <w:top w:val="single" w:sz="2" w:space="0" w:color="AAAAAA"/>
+              <w:left w:val="single" w:sz="2" w:space="0" w:color="AAAAAA"/>
+              <w:bottom w:val="single" w:sz="2" w:space="0" w:color="AAAAAA"/>
+              <w:right w:val="single" w:sz="2" w:space="0" w:color="AAAAAA"/>
+            </w:tcBorders>
+            <w:tcMar>
+              <w:top w:w="80" w:type="dxa"/>
+              <w:left w:w="120" w:type="dxa"/>
+              <w:bottom w:w="80" w:type="dxa"/>
+              <w:right w:w="120" w:type="dxa"/>
+            </w:tcMar>
+            <w:vAlign w:val="center"/>
+            <w:hideMark/>
           </w:tcPr>
           <w:p>
             <w:r>
@@ -316,18 +336,19 @@
           <w:tcPr>
             <w:tcW w:w="4426" w:type="dxa"/>
             <w:tcBorders>
-              <w:top w:val="single" w:sz="4" w:space="0" w:color="000000"/>
-              <w:left w:val="single" w:sz="4" w:space="0" w:color="000000"/>
-              <w:bottom w:val="single" w:sz="4" w:space="0" w:color="000000"/>
-              <w:right w:val="single" w:sz="4" w:space="0" w:color="000000"/>
-            </w:tcBorders>
-            <w:tcMar>
-              <w:top w:w="60" w:type="dxa"/>
-              <w:left w:w="108" w:type="dxa"/>
-              <w:bottom w:w="60" w:type="dxa"/>
-              <w:right w:w="108" w:type="dxa"/>
-            </w:tcMar>
-            <w:vAlign w:val="center"/>
+              <w:top w:val="single" w:sz="2" w:space="0" w:color="AAAAAA"/>
+              <w:left w:val="single" w:sz="2" w:space="0" w:color="AAAAAA"/>
+              <w:bottom w:val="single" w:sz="2" w:space="0" w:color="AAAAAA"/>
+              <w:right w:val="single" w:sz="2" w:space="0" w:color="AAAAAA"/>
+            </w:tcBorders>
+            <w:tcMar>
+              <w:top w:w="80" w:type="dxa"/>
+              <w:left w:w="120" w:type="dxa"/>
+              <w:bottom w:w="80" w:type="dxa"/>
+              <w:right w:w="120" w:type="dxa"/>
+            </w:tcMar>
+            <w:vAlign w:val="center"/>
+            <w:hideMark/>
           </w:tcPr>
           <w:p>
             <w:r>
@@ -337,28 +358,23 @@
         </w:tc>
       </w:tr>
       <w:tr>
-        <w:tblPrEx>
-          <w:tblCellMar>
-            <w:top w:w="0" w:type="dxa"/>
-            <w:bottom w:w="0" w:type="dxa"/>
-          </w:tblCellMar>
-        </w:tblPrEx>
-        <w:tc>
-          <w:tcPr>
-            <w:tcW w:w="1700" w:type="dxa"/>
-            <w:tcBorders>
-              <w:top w:val="single" w:sz="4" w:space="0" w:color="000000"/>
-              <w:left w:val="single" w:sz="4" w:space="0" w:color="000000"/>
-              <w:bottom w:val="single" w:sz="4" w:space="0" w:color="000000"/>
-              <w:right w:val="single" w:sz="4" w:space="0" w:color="000000"/>
-            </w:tcBorders>
-            <w:tcMar>
-              <w:top w:w="60" w:type="dxa"/>
-              <w:left w:w="108" w:type="dxa"/>
-              <w:bottom w:w="60" w:type="dxa"/>
-              <w:right w:w="108" w:type="dxa"/>
-            </w:tcMar>
-            <w:vAlign w:val="center"/>
+        <w:tc>
+          <w:tcPr>
+            <w:tcW w:w="1400" w:type="dxa"/>
+            <w:tcBorders>
+              <w:top w:val="single" w:sz="2" w:space="0" w:color="AAAAAA"/>
+              <w:left w:val="single" w:sz="2" w:space="0" w:color="AAAAAA"/>
+              <w:bottom w:val="single" w:sz="2" w:space="0" w:color="AAAAAA"/>
+              <w:right w:val="single" w:sz="2" w:space="0" w:color="AAAAAA"/>
+            </w:tcBorders>
+            <w:tcMar>
+              <w:top w:w="80" w:type="dxa"/>
+              <w:left w:w="120" w:type="dxa"/>
+              <w:bottom w:w="80" w:type="dxa"/>
+              <w:right w:w="120" w:type="dxa"/>
+            </w:tcMar>
+            <w:vAlign w:val="center"/>
+            <w:hideMark/>
           </w:tcPr>
           <w:p>
             <w:r>
@@ -372,20 +388,21 @@
         </w:tc>
         <w:tc>
           <w:tcPr>
-            <w:tcW w:w="900" w:type="dxa"/>
-            <w:tcBorders>
-              <w:top w:val="single" w:sz="4" w:space="0" w:color="000000"/>
-              <w:left w:val="single" w:sz="4" w:space="0" w:color="000000"/>
-              <w:bottom w:val="single" w:sz="4" w:space="0" w:color="000000"/>
-              <w:right w:val="single" w:sz="4" w:space="0" w:color="000000"/>
-            </w:tcBorders>
-            <w:tcMar>
-              <w:top w:w="60" w:type="dxa"/>
-              <w:left w:w="108" w:type="dxa"/>
-              <w:bottom w:w="60" w:type="dxa"/>
-              <w:right w:w="108" w:type="dxa"/>
-            </w:tcMar>
-            <w:vAlign w:val="center"/>
+            <w:tcW w:w="1200" w:type="dxa"/>
+            <w:tcBorders>
+              <w:top w:val="single" w:sz="2" w:space="0" w:color="AAAAAA"/>
+              <w:left w:val="single" w:sz="2" w:space="0" w:color="AAAAAA"/>
+              <w:bottom w:val="single" w:sz="2" w:space="0" w:color="AAAAAA"/>
+              <w:right w:val="single" w:sz="2" w:space="0" w:color="AAAAAA"/>
+            </w:tcBorders>
+            <w:tcMar>
+              <w:top w:w="80" w:type="dxa"/>
+              <w:left w:w="120" w:type="dxa"/>
+              <w:bottom w:w="80" w:type="dxa"/>
+              <w:right w:w="120" w:type="dxa"/>
+            </w:tcMar>
+            <w:vAlign w:val="center"/>
+            <w:hideMark/>
           </w:tcPr>
           <w:p>
             <w:r>
@@ -397,18 +414,19 @@
           <w:tcPr>
             <w:tcW w:w="2000" w:type="dxa"/>
             <w:tcBorders>
-              <w:top w:val="single" w:sz="4" w:space="0" w:color="000000"/>
-              <w:left w:val="single" w:sz="4" w:space="0" w:color="000000"/>
-              <w:bottom w:val="single" w:sz="4" w:space="0" w:color="000000"/>
-              <w:right w:val="single" w:sz="4" w:space="0" w:color="000000"/>
-            </w:tcBorders>
-            <w:tcMar>
-              <w:top w:w="60" w:type="dxa"/>
-              <w:left w:w="108" w:type="dxa"/>
-              <w:bottom w:w="60" w:type="dxa"/>
-              <w:right w:w="108" w:type="dxa"/>
-            </w:tcMar>
-            <w:vAlign w:val="center"/>
+              <w:top w:val="single" w:sz="2" w:space="0" w:color="AAAAAA"/>
+              <w:left w:val="single" w:sz="2" w:space="0" w:color="AAAAAA"/>
+              <w:bottom w:val="single" w:sz="2" w:space="0" w:color="AAAAAA"/>
+              <w:right w:val="single" w:sz="2" w:space="0" w:color="AAAAAA"/>
+            </w:tcBorders>
+            <w:tcMar>
+              <w:top w:w="80" w:type="dxa"/>
+              <w:left w:w="120" w:type="dxa"/>
+              <w:bottom w:w="80" w:type="dxa"/>
+              <w:right w:w="120" w:type="dxa"/>
+            </w:tcMar>
+            <w:vAlign w:val="center"/>
+            <w:hideMark/>
           </w:tcPr>
           <w:p>
             <w:r>
@@ -420,18 +438,19 @@
           <w:tcPr>
             <w:tcW w:w="4426" w:type="dxa"/>
             <w:tcBorders>
-              <w:top w:val="single" w:sz="4" w:space="0" w:color="000000"/>
-              <w:left w:val="single" w:sz="4" w:space="0" w:color="000000"/>
-              <w:bottom w:val="single" w:sz="4" w:space="0" w:color="000000"/>
-              <w:right w:val="single" w:sz="4" w:space="0" w:color="000000"/>
-            </w:tcBorders>
-            <w:tcMar>
-              <w:top w:w="60" w:type="dxa"/>
-              <w:left w:w="108" w:type="dxa"/>
-              <w:bottom w:w="60" w:type="dxa"/>
-              <w:right w:w="108" w:type="dxa"/>
-            </w:tcMar>
-            <w:vAlign w:val="center"/>
+              <w:top w:val="single" w:sz="2" w:space="0" w:color="AAAAAA"/>
+              <w:left w:val="single" w:sz="2" w:space="0" w:color="AAAAAA"/>
+              <w:bottom w:val="single" w:sz="2" w:space="0" w:color="AAAAAA"/>
+              <w:right w:val="single" w:sz="2" w:space="0" w:color="AAAAAA"/>
+            </w:tcBorders>
+            <w:tcMar>
+              <w:top w:w="80" w:type="dxa"/>
+              <w:left w:w="120" w:type="dxa"/>
+              <w:bottom w:w="80" w:type="dxa"/>
+              <w:right w:w="120" w:type="dxa"/>
+            </w:tcMar>
+            <w:vAlign w:val="center"/>
+            <w:hideMark/>
           </w:tcPr>
           <w:p>
             <w:r>
@@ -441,28 +460,23 @@
         </w:tc>
       </w:tr>
       <w:tr>
-        <w:tblPrEx>
-          <w:tblCellMar>
-            <w:top w:w="0" w:type="dxa"/>
-            <w:bottom w:w="0" w:type="dxa"/>
-          </w:tblCellMar>
-        </w:tblPrEx>
-        <w:tc>
-          <w:tcPr>
-            <w:tcW w:w="1700" w:type="dxa"/>
-            <w:tcBorders>
-              <w:top w:val="single" w:sz="4" w:space="0" w:color="000000"/>
-              <w:left w:val="single" w:sz="4" w:space="0" w:color="000000"/>
-              <w:bottom w:val="single" w:sz="4" w:space="0" w:color="000000"/>
-              <w:right w:val="single" w:sz="4" w:space="0" w:color="000000"/>
-            </w:tcBorders>
-            <w:tcMar>
-              <w:top w:w="60" w:type="dxa"/>
-              <w:left w:w="108" w:type="dxa"/>
-              <w:bottom w:w="60" w:type="dxa"/>
-              <w:right w:w="108" w:type="dxa"/>
-            </w:tcMar>
-            <w:vAlign w:val="center"/>
+        <w:tc>
+          <w:tcPr>
+            <w:tcW w:w="1400" w:type="dxa"/>
+            <w:tcBorders>
+              <w:top w:val="single" w:sz="2" w:space="0" w:color="AAAAAA"/>
+              <w:left w:val="single" w:sz="2" w:space="0" w:color="AAAAAA"/>
+              <w:bottom w:val="single" w:sz="2" w:space="0" w:color="AAAAAA"/>
+              <w:right w:val="single" w:sz="2" w:space="0" w:color="AAAAAA"/>
+            </w:tcBorders>
+            <w:tcMar>
+              <w:top w:w="80" w:type="dxa"/>
+              <w:left w:w="120" w:type="dxa"/>
+              <w:bottom w:w="80" w:type="dxa"/>
+              <w:right w:w="120" w:type="dxa"/>
+            </w:tcMar>
+            <w:vAlign w:val="center"/>
+            <w:hideMark/>
           </w:tcPr>
           <w:p>
             <w:r>
@@ -476,20 +490,21 @@
         </w:tc>
         <w:tc>
           <w:tcPr>
-            <w:tcW w:w="900" w:type="dxa"/>
-            <w:tcBorders>
-              <w:top w:val="single" w:sz="4" w:space="0" w:color="000000"/>
-              <w:left w:val="single" w:sz="4" w:space="0" w:color="000000"/>
-              <w:bottom w:val="single" w:sz="4" w:space="0" w:color="000000"/>
-              <w:right w:val="single" w:sz="4" w:space="0" w:color="000000"/>
-            </w:tcBorders>
-            <w:tcMar>
-              <w:top w:w="60" w:type="dxa"/>
-              <w:left w:w="108" w:type="dxa"/>
-              <w:bottom w:w="60" w:type="dxa"/>
-              <w:right w:w="108" w:type="dxa"/>
-            </w:tcMar>
-            <w:vAlign w:val="center"/>
+            <w:tcW w:w="1200" w:type="dxa"/>
+            <w:tcBorders>
+              <w:top w:val="single" w:sz="2" w:space="0" w:color="AAAAAA"/>
+              <w:left w:val="single" w:sz="2" w:space="0" w:color="AAAAAA"/>
+              <w:bottom w:val="single" w:sz="2" w:space="0" w:color="AAAAAA"/>
+              <w:right w:val="single" w:sz="2" w:space="0" w:color="AAAAAA"/>
+            </w:tcBorders>
+            <w:tcMar>
+              <w:top w:w="80" w:type="dxa"/>
+              <w:left w:w="120" w:type="dxa"/>
+              <w:bottom w:w="80" w:type="dxa"/>
+              <w:right w:w="120" w:type="dxa"/>
+            </w:tcMar>
+            <w:vAlign w:val="center"/>
+            <w:hideMark/>
           </w:tcPr>
           <w:p>
             <w:r>
@@ -501,18 +516,19 @@
           <w:tcPr>
             <w:tcW w:w="2000" w:type="dxa"/>
             <w:tcBorders>
-              <w:top w:val="single" w:sz="4" w:space="0" w:color="000000"/>
-              <w:left w:val="single" w:sz="4" w:space="0" w:color="000000"/>
-              <w:bottom w:val="single" w:sz="4" w:space="0" w:color="000000"/>
-              <w:right w:val="single" w:sz="4" w:space="0" w:color="000000"/>
-            </w:tcBorders>
-            <w:tcMar>
-              <w:top w:w="60" w:type="dxa"/>
-              <w:left w:w="108" w:type="dxa"/>
-              <w:bottom w:w="60" w:type="dxa"/>
-              <w:right w:w="108" w:type="dxa"/>
-            </w:tcMar>
-            <w:vAlign w:val="center"/>
+              <w:top w:val="single" w:sz="2" w:space="0" w:color="AAAAAA"/>
+              <w:left w:val="single" w:sz="2" w:space="0" w:color="AAAAAA"/>
+              <w:bottom w:val="single" w:sz="2" w:space="0" w:color="AAAAAA"/>
+              <w:right w:val="single" w:sz="2" w:space="0" w:color="AAAAAA"/>
+            </w:tcBorders>
+            <w:tcMar>
+              <w:top w:w="80" w:type="dxa"/>
+              <w:left w:w="120" w:type="dxa"/>
+              <w:bottom w:w="80" w:type="dxa"/>
+              <w:right w:w="120" w:type="dxa"/>
+            </w:tcMar>
+            <w:vAlign w:val="center"/>
+            <w:hideMark/>
           </w:tcPr>
           <w:p>
             <w:r>
@@ -524,18 +540,19 @@
           <w:tcPr>
             <w:tcW w:w="4426" w:type="dxa"/>
             <w:tcBorders>
-              <w:top w:val="single" w:sz="4" w:space="0" w:color="000000"/>
-              <w:left w:val="single" w:sz="4" w:space="0" w:color="000000"/>
-              <w:bottom w:val="single" w:sz="4" w:space="0" w:color="000000"/>
-              <w:right w:val="single" w:sz="4" w:space="0" w:color="000000"/>
-            </w:tcBorders>
-            <w:tcMar>
-              <w:top w:w="60" w:type="dxa"/>
-              <w:left w:w="108" w:type="dxa"/>
-              <w:bottom w:w="60" w:type="dxa"/>
-              <w:right w:w="108" w:type="dxa"/>
-            </w:tcMar>
-            <w:vAlign w:val="center"/>
+              <w:top w:val="single" w:sz="2" w:space="0" w:color="AAAAAA"/>
+              <w:left w:val="single" w:sz="2" w:space="0" w:color="AAAAAA"/>
+              <w:bottom w:val="single" w:sz="2" w:space="0" w:color="AAAAAA"/>
+              <w:right w:val="single" w:sz="2" w:space="0" w:color="AAAAAA"/>
+            </w:tcBorders>
+            <w:tcMar>
+              <w:top w:w="80" w:type="dxa"/>
+              <w:left w:w="120" w:type="dxa"/>
+              <w:bottom w:w="80" w:type="dxa"/>
+              <w:right w:w="120" w:type="dxa"/>
+            </w:tcMar>
+            <w:vAlign w:val="center"/>
+            <w:hideMark/>
           </w:tcPr>
           <w:p>
             <w:r>
@@ -545,28 +562,23 @@
         </w:tc>
       </w:tr>
       <w:tr>
-        <w:tblPrEx>
-          <w:tblCellMar>
-            <w:top w:w="0" w:type="dxa"/>
-            <w:bottom w:w="0" w:type="dxa"/>
-          </w:tblCellMar>
-        </w:tblPrEx>
-        <w:tc>
-          <w:tcPr>
-            <w:tcW w:w="1700" w:type="dxa"/>
-            <w:tcBorders>
-              <w:top w:val="single" w:sz="4" w:space="0" w:color="000000"/>
-              <w:left w:val="single" w:sz="4" w:space="0" w:color="000000"/>
-              <w:bottom w:val="single" w:sz="4" w:space="0" w:color="000000"/>
-              <w:right w:val="single" w:sz="4" w:space="0" w:color="000000"/>
-            </w:tcBorders>
-            <w:tcMar>
-              <w:top w:w="60" w:type="dxa"/>
-              <w:left w:w="108" w:type="dxa"/>
-              <w:bottom w:w="60" w:type="dxa"/>
-              <w:right w:w="108" w:type="dxa"/>
-            </w:tcMar>
-            <w:vAlign w:val="center"/>
+        <w:tc>
+          <w:tcPr>
+            <w:tcW w:w="1400" w:type="dxa"/>
+            <w:tcBorders>
+              <w:top w:val="single" w:sz="2" w:space="0" w:color="AAAAAA"/>
+              <w:left w:val="single" w:sz="2" w:space="0" w:color="AAAAAA"/>
+              <w:bottom w:val="single" w:sz="2" w:space="0" w:color="AAAAAA"/>
+              <w:right w:val="single" w:sz="2" w:space="0" w:color="AAAAAA"/>
+            </w:tcBorders>
+            <w:tcMar>
+              <w:top w:w="80" w:type="dxa"/>
+              <w:left w:w="120" w:type="dxa"/>
+              <w:bottom w:w="80" w:type="dxa"/>
+              <w:right w:w="120" w:type="dxa"/>
+            </w:tcMar>
+            <w:vAlign w:val="center"/>
+            <w:hideMark/>
           </w:tcPr>
           <w:p>
             <w:r>
@@ -580,20 +592,21 @@
         </w:tc>
         <w:tc>
           <w:tcPr>
-            <w:tcW w:w="900" w:type="dxa"/>
-            <w:tcBorders>
-              <w:top w:val="single" w:sz="4" w:space="0" w:color="000000"/>
-              <w:left w:val="single" w:sz="4" w:space="0" w:color="000000"/>
-              <w:bottom w:val="single" w:sz="4" w:space="0" w:color="000000"/>
-              <w:right w:val="single" w:sz="4" w:space="0" w:color="000000"/>
-            </w:tcBorders>
-            <w:tcMar>
-              <w:top w:w="60" w:type="dxa"/>
-              <w:left w:w="108" w:type="dxa"/>
-              <w:bottom w:w="60" w:type="dxa"/>
-              <w:right w:w="108" w:type="dxa"/>
-            </w:tcMar>
-            <w:vAlign w:val="center"/>
+            <w:tcW w:w="1200" w:type="dxa"/>
+            <w:tcBorders>
+              <w:top w:val="single" w:sz="2" w:space="0" w:color="AAAAAA"/>
+              <w:left w:val="single" w:sz="2" w:space="0" w:color="AAAAAA"/>
+              <w:bottom w:val="single" w:sz="2" w:space="0" w:color="AAAAAA"/>
+              <w:right w:val="single" w:sz="2" w:space="0" w:color="AAAAAA"/>
+            </w:tcBorders>
+            <w:tcMar>
+              <w:top w:w="80" w:type="dxa"/>
+              <w:left w:w="120" w:type="dxa"/>
+              <w:bottom w:w="80" w:type="dxa"/>
+              <w:right w:w="120" w:type="dxa"/>
+            </w:tcMar>
+            <w:vAlign w:val="center"/>
+            <w:hideMark/>
           </w:tcPr>
           <w:p>
             <w:r>
@@ -605,18 +618,19 @@
           <w:tcPr>
             <w:tcW w:w="2000" w:type="dxa"/>
             <w:tcBorders>
-              <w:top w:val="single" w:sz="4" w:space="0" w:color="000000"/>
-              <w:left w:val="single" w:sz="4" w:space="0" w:color="000000"/>
-              <w:bottom w:val="single" w:sz="4" w:space="0" w:color="000000"/>
-              <w:right w:val="single" w:sz="4" w:space="0" w:color="000000"/>
-            </w:tcBorders>
-            <w:tcMar>
-              <w:top w:w="60" w:type="dxa"/>
-              <w:left w:w="108" w:type="dxa"/>
-              <w:bottom w:w="60" w:type="dxa"/>
-              <w:right w:w="108" w:type="dxa"/>
-            </w:tcMar>
-            <w:vAlign w:val="center"/>
+              <w:top w:val="single" w:sz="2" w:space="0" w:color="AAAAAA"/>
+              <w:left w:val="single" w:sz="2" w:space="0" w:color="AAAAAA"/>
+              <w:bottom w:val="single" w:sz="2" w:space="0" w:color="AAAAAA"/>
+              <w:right w:val="single" w:sz="2" w:space="0" w:color="AAAAAA"/>
+            </w:tcBorders>
+            <w:tcMar>
+              <w:top w:w="80" w:type="dxa"/>
+              <w:left w:w="120" w:type="dxa"/>
+              <w:bottom w:w="80" w:type="dxa"/>
+              <w:right w:w="120" w:type="dxa"/>
+            </w:tcMar>
+            <w:vAlign w:val="center"/>
+            <w:hideMark/>
           </w:tcPr>
           <w:p>
             <w:r>
@@ -628,35 +642,45 @@
           <w:tcPr>
             <w:tcW w:w="4426" w:type="dxa"/>
             <w:tcBorders>
-              <w:top w:val="single" w:sz="4" w:space="0" w:color="000000"/>
-              <w:left w:val="single" w:sz="4" w:space="0" w:color="000000"/>
-              <w:bottom w:val="single" w:sz="4" w:space="0" w:color="000000"/>
-              <w:right w:val="single" w:sz="4" w:space="0" w:color="000000"/>
-            </w:tcBorders>
-            <w:tcMar>
-              <w:top w:w="60" w:type="dxa"/>
-              <w:left w:w="108" w:type="dxa"/>
-              <w:bottom w:w="60" w:type="dxa"/>
-              <w:right w:w="108" w:type="dxa"/>
-            </w:tcMar>
-            <w:vAlign w:val="center"/>
-          </w:tcPr>
-          <w:p>
-            <w:r>
-              <w:t>Phân loại sức khỏe. Điều kiện đạt: ∈ {1, 2, 3}</w:t>
+              <w:top w:val="single" w:sz="2" w:space="0" w:color="AAAAAA"/>
+              <w:left w:val="single" w:sz="2" w:space="0" w:color="AAAAAA"/>
+              <w:bottom w:val="single" w:sz="2" w:space="0" w:color="AAAAAA"/>
+              <w:right w:val="single" w:sz="2" w:space="0" w:color="AAAAAA"/>
+            </w:tcBorders>
+            <w:tcMar>
+              <w:top w:w="80" w:type="dxa"/>
+              <w:left w:w="120" w:type="dxa"/>
+              <w:bottom w:w="80" w:type="dxa"/>
+              <w:right w:w="120" w:type="dxa"/>
+            </w:tcMar>
+            <w:vAlign w:val="center"/>
+            <w:hideMark/>
+          </w:tcPr>
+          <w:p>
+            <w:r>
+              <w:t xml:space="preserve">Phân loại sức khỏe. Điều kiện đạt: </w:t>
+            </w:r>
+            <w:r>
+              <w:rPr>
+                <w:rFonts w:ascii="Cambria Math" w:hAnsi="Cambria Math" w:cs="Cambria Math"/>
+              </w:rPr>
+              <w:t>∈</w:t>
+            </w:r>
+            <w:r>
+              <w:t xml:space="preserve"> {1, 2, 3}</w:t>
             </w:r>
           </w:p>
         </w:tc>
       </w:tr>
     </w:tbl>
-    <w:p>
-      <w:pPr>
-        <w:spacing w:after="100"/>
-      </w:pPr>
-    </w:p>
-    <w:p>
-      <w:pPr>
-        <w:spacing w:after="160"/>
+    <w:p/>
+    <w:p>
+      <w:pPr>
+        <w:rPr>
+          <w:b/>
+          <w:bCs/>
+          <w:lang w:val="vi-VN"/>
+        </w:rPr>
       </w:pPr>
       <w:r>
         <w:rPr>
@@ -668,7 +692,16 @@
     </w:p>
     <w:p>
       <w:pPr>
-        <w:spacing w:after="160"/>
+        <w:rPr>
+          <w:lang w:val="vi-VN"/>
+        </w:rPr>
+      </w:pPr>
+    </w:p>
+    <w:p>
+      <w:pPr>
+        <w:rPr>
+          <w:lang w:val="vi-VN"/>
+        </w:rPr>
       </w:pPr>
       <w:r>
         <w:t>Ứng viên ĐẠT khi và chỉ khi thỏa tất cả 4 điều kiện sau:</w:t>
@@ -676,12 +709,18 @@
     </w:p>
     <w:p>
       <w:pPr>
-        <w:pStyle w:val="ListParagraph"/>
+        <w:rPr>
+          <w:lang w:val="vi-VN"/>
+        </w:rPr>
+      </w:pPr>
+    </w:p>
+    <w:p>
+      <w:pPr>
         <w:numPr>
           <w:ilvl w:val="0"/>
-          <w:numId w:val="2"/>
+          <w:numId w:val="3"/>
         </w:numPr>
-        <w:spacing w:after="100"/>
+        <w:spacing w:after="160" w:line="259" w:lineRule="auto"/>
       </w:pPr>
       <w:r>
         <w:t>C1: 18 ≤ age ≤ 25</w:t>
@@ -689,12 +728,11 @@
     </w:p>
     <w:p>
       <w:pPr>
-        <w:pStyle w:val="ListParagraph"/>
         <w:numPr>
           <w:ilvl w:val="0"/>
-          <w:numId w:val="2"/>
+          <w:numId w:val="3"/>
         </w:numPr>
-        <w:spacing w:after="100"/>
+        <w:spacing w:after="160" w:line="259" w:lineRule="auto"/>
       </w:pPr>
       <w:r>
         <w:t>C2: 18.0 ≤ bmi ≤ 30.0</w:t>
@@ -702,12 +740,11 @@
     </w:p>
     <w:p>
       <w:pPr>
-        <w:pStyle w:val="ListParagraph"/>
         <w:numPr>
           <w:ilvl w:val="0"/>
-          <w:numId w:val="2"/>
+          <w:numId w:val="3"/>
         </w:numPr>
-        <w:spacing w:after="100"/>
+        <w:spacing w:after="160" w:line="259" w:lineRule="auto"/>
       </w:pPr>
       <w:r>
         <w:t>C3: |vision| &lt; 1.5 (cận dưới 1.5 độ)</w:t>
@@ -715,25 +752,33 @@
     </w:p>
     <w:p>
       <w:pPr>
-        <w:pStyle w:val="ListParagraph"/>
         <w:numPr>
           <w:ilvl w:val="0"/>
-          <w:numId w:val="2"/>
+          <w:numId w:val="3"/>
         </w:numPr>
-        <w:spacing w:after="100"/>
-      </w:pPr>
-      <w:r>
-        <w:t>C4: health_class ∈ {1, 2, 3}</w:t>
-      </w:r>
-    </w:p>
-    <w:p>
-      <w:pPr>
-        <w:spacing w:after="100"/>
-      </w:pPr>
-    </w:p>
-    <w:p>
-      <w:pPr>
-        <w:spacing w:after="160"/>
+        <w:spacing w:after="160" w:line="259" w:lineRule="auto"/>
+      </w:pPr>
+      <w:r>
+        <w:t xml:space="preserve">C4: health_class </w:t>
+      </w:r>
+      <w:r>
+        <w:rPr>
+          <w:rFonts w:ascii="Cambria Math" w:hAnsi="Cambria Math" w:cs="Cambria Math"/>
+        </w:rPr>
+        <w:t>∈</w:t>
+      </w:r>
+      <w:r>
+        <w:t xml:space="preserve"> {1, 2, 3}</w:t>
+      </w:r>
+    </w:p>
+    <w:p/>
+    <w:p>
+      <w:pPr>
+        <w:rPr>
+          <w:b/>
+          <w:bCs/>
+          <w:lang w:val="vi-VN"/>
+        </w:rPr>
       </w:pPr>
       <w:r>
         <w:rPr>
@@ -745,7 +790,16 @@
     </w:p>
     <w:p>
       <w:pPr>
-        <w:spacing w:after="160"/>
+        <w:rPr>
+          <w:lang w:val="vi-VN"/>
+        </w:rPr>
+      </w:pPr>
+    </w:p>
+    <w:p>
+      <w:pPr>
+        <w:rPr>
+          <w:lang w:val="vi-VN"/>
+        </w:rPr>
       </w:pPr>
       <w:r>
         <w:t>Hàm phải trả về lỗi (ValueError) nếu gặp các trường hợp sau:</w:t>
@@ -753,12 +807,18 @@
     </w:p>
     <w:p>
       <w:pPr>
-        <w:pStyle w:val="ListParagraph"/>
+        <w:rPr>
+          <w:lang w:val="vi-VN"/>
+        </w:rPr>
+      </w:pPr>
+    </w:p>
+    <w:p>
+      <w:pPr>
         <w:numPr>
           <w:ilvl w:val="0"/>
-          <w:numId w:val="2"/>
+          <w:numId w:val="3"/>
         </w:numPr>
-        <w:spacing w:after="100"/>
+        <w:spacing w:after="160" w:line="259" w:lineRule="auto"/>
       </w:pPr>
       <w:r>
         <w:t>Chỉ số age nằm ngoài khoảng [18, 25].</w:t>
@@ -766,12 +826,11 @@
     </w:p>
     <w:p>
       <w:pPr>
-        <w:pStyle w:val="ListParagraph"/>
         <w:numPr>
           <w:ilvl w:val="0"/>
-          <w:numId w:val="2"/>
+          <w:numId w:val="3"/>
         </w:numPr>
-        <w:spacing w:after="100"/>
+        <w:spacing w:after="160" w:line="259" w:lineRule="auto"/>
       </w:pPr>
       <w:r>
         <w:t>Chỉ số bmi nằm ngoài khoảng [10.0, 40.0].</w:t>
@@ -779,12 +838,11 @@
     </w:p>
     <w:p>
       <w:pPr>
-        <w:pStyle w:val="ListParagraph"/>
         <w:numPr>
           <w:ilvl w:val="0"/>
-          <w:numId w:val="2"/>
+          <w:numId w:val="3"/>
         </w:numPr>
-        <w:spacing w:after="100"/>
+        <w:spacing w:after="160" w:line="259" w:lineRule="auto"/>
       </w:pPr>
       <w:r>
         <w:t>Chỉ số vision nằm ngoài khoảng [-20.0, 0.0].</w:t>
@@ -792,12 +850,11 @@
     </w:p>
     <w:p>
       <w:pPr>
-        <w:pStyle w:val="ListParagraph"/>
         <w:numPr>
           <w:ilvl w:val="0"/>
-          <w:numId w:val="2"/>
+          <w:numId w:val="3"/>
         </w:numPr>
-        <w:spacing w:after="100"/>
+        <w:spacing w:after="160" w:line="259" w:lineRule="auto"/>
       </w:pPr>
       <w:r>
         <w:t>health_class không nằm trong tập {1, 2, 3, 4, 5, 6}.</w:t>
@@ -838,7 +895,6 @@
           <w:b/>
           <w:bCs/>
         </w:rPr>
-        <w:lastRenderedPageBreak/>
         <w:t>ĐỒ THỊ DÒNG ĐIỀU KHIỂN (CFG)</w:t>
       </w:r>
     </w:p>
@@ -1283,12 +1339,6 @@
         <w:gridCol w:w="2705"/>
       </w:tblGrid>
       <w:tr>
-        <w:tblPrEx>
-          <w:tblCellMar>
-            <w:top w:w="0" w:type="dxa"/>
-            <w:bottom w:w="0" w:type="dxa"/>
-          </w:tblCellMar>
-        </w:tblPrEx>
         <w:tc>
           <w:tcPr>
             <w:tcW w:w="600" w:type="dxa"/>
@@ -1432,12 +1482,6 @@
         </w:tc>
       </w:tr>
       <w:tr>
-        <w:tblPrEx>
-          <w:tblCellMar>
-            <w:top w:w="0" w:type="dxa"/>
-            <w:bottom w:w="0" w:type="dxa"/>
-          </w:tblCellMar>
-        </w:tblPrEx>
         <w:tc>
           <w:tcPr>
             <w:tcW w:w="600" w:type="dxa"/>
@@ -1562,12 +1606,6 @@
         </w:tc>
       </w:tr>
       <w:tr>
-        <w:tblPrEx>
-          <w:tblCellMar>
-            <w:top w:w="0" w:type="dxa"/>
-            <w:bottom w:w="0" w:type="dxa"/>
-          </w:tblCellMar>
-        </w:tblPrEx>
         <w:tc>
           <w:tcPr>
             <w:tcW w:w="600" w:type="dxa"/>
@@ -1692,12 +1730,6 @@
         </w:tc>
       </w:tr>
       <w:tr>
-        <w:tblPrEx>
-          <w:tblCellMar>
-            <w:top w:w="0" w:type="dxa"/>
-            <w:bottom w:w="0" w:type="dxa"/>
-          </w:tblCellMar>
-        </w:tblPrEx>
         <w:tc>
           <w:tcPr>
             <w:tcW w:w="600" w:type="dxa"/>
@@ -1822,12 +1854,6 @@
         </w:tc>
       </w:tr>
       <w:tr>
-        <w:tblPrEx>
-          <w:tblCellMar>
-            <w:top w:w="0" w:type="dxa"/>
-            <w:bottom w:w="0" w:type="dxa"/>
-          </w:tblCellMar>
-        </w:tblPrEx>
         <w:tc>
           <w:tcPr>
             <w:tcW w:w="600" w:type="dxa"/>
@@ -1952,12 +1978,6 @@
         </w:tc>
       </w:tr>
       <w:tr>
-        <w:tblPrEx>
-          <w:tblCellMar>
-            <w:top w:w="0" w:type="dxa"/>
-            <w:bottom w:w="0" w:type="dxa"/>
-          </w:tblCellMar>
-        </w:tblPrEx>
         <w:tc>
           <w:tcPr>
             <w:tcW w:w="600" w:type="dxa"/>
@@ -1980,7 +2000,6 @@
               <w:jc w:val="center"/>
             </w:pPr>
             <w:r>
-              <w:lastRenderedPageBreak/>
               <w:t>5</w:t>
             </w:r>
           </w:p>
@@ -2083,12 +2102,6 @@
         </w:tc>
       </w:tr>
       <w:tr>
-        <w:tblPrEx>
-          <w:tblCellMar>
-            <w:top w:w="0" w:type="dxa"/>
-            <w:bottom w:w="0" w:type="dxa"/>
-          </w:tblCellMar>
-        </w:tblPrEx>
         <w:tc>
           <w:tcPr>
             <w:tcW w:w="600" w:type="dxa"/>
@@ -2111,6 +2124,7 @@
               <w:jc w:val="center"/>
             </w:pPr>
             <w:r>
+              <w:lastRenderedPageBreak/>
               <w:t>6</w:t>
             </w:r>
           </w:p>
@@ -2213,12 +2227,6 @@
         </w:tc>
       </w:tr>
       <w:tr>
-        <w:tblPrEx>
-          <w:tblCellMar>
-            <w:top w:w="0" w:type="dxa"/>
-            <w:bottom w:w="0" w:type="dxa"/>
-          </w:tblCellMar>
-        </w:tblPrEx>
         <w:tc>
           <w:tcPr>
             <w:tcW w:w="600" w:type="dxa"/>
@@ -2343,12 +2351,6 @@
         </w:tc>
       </w:tr>
       <w:tr>
-        <w:tblPrEx>
-          <w:tblCellMar>
-            <w:top w:w="0" w:type="dxa"/>
-            <w:bottom w:w="0" w:type="dxa"/>
-          </w:tblCellMar>
-        </w:tblPrEx>
         <w:tc>
           <w:tcPr>
             <w:tcW w:w="600" w:type="dxa"/>
@@ -2473,12 +2475,6 @@
         </w:tc>
       </w:tr>
       <w:tr>
-        <w:tblPrEx>
-          <w:tblCellMar>
-            <w:top w:w="0" w:type="dxa"/>
-            <w:bottom w:w="0" w:type="dxa"/>
-          </w:tblCellMar>
-        </w:tblPrEx>
         <w:tc>
           <w:tcPr>
             <w:tcW w:w="600" w:type="dxa"/>
@@ -2603,12 +2599,6 @@
         </w:tc>
       </w:tr>
       <w:tr>
-        <w:tblPrEx>
-          <w:tblCellMar>
-            <w:top w:w="0" w:type="dxa"/>
-            <w:bottom w:w="0" w:type="dxa"/>
-          </w:tblCellMar>
-        </w:tblPrEx>
         <w:tc>
           <w:tcPr>
             <w:tcW w:w="600" w:type="dxa"/>
@@ -3095,12 +3085,6 @@
         <w:gridCol w:w="1449"/>
       </w:tblGrid>
       <w:tr>
-        <w:tblPrEx>
-          <w:tblCellMar>
-            <w:top w:w="0" w:type="dxa"/>
-            <w:bottom w:w="0" w:type="dxa"/>
-          </w:tblCellMar>
-        </w:tblPrEx>
         <w:tc>
           <w:tcPr>
             <w:tcW w:w="600" w:type="dxa"/>
@@ -3274,12 +3258,6 @@
         </w:tc>
       </w:tr>
       <w:tr>
-        <w:tblPrEx>
-          <w:tblCellMar>
-            <w:top w:w="0" w:type="dxa"/>
-            <w:bottom w:w="0" w:type="dxa"/>
-          </w:tblCellMar>
-        </w:tblPrEx>
         <w:tc>
           <w:tcPr>
             <w:tcW w:w="600" w:type="dxa"/>
@@ -3430,12 +3408,6 @@
         </w:tc>
       </w:tr>
       <w:tr>
-        <w:tblPrEx>
-          <w:tblCellMar>
-            <w:top w:w="0" w:type="dxa"/>
-            <w:bottom w:w="0" w:type="dxa"/>
-          </w:tblCellMar>
-        </w:tblPrEx>
         <w:tc>
           <w:tcPr>
             <w:tcW w:w="600" w:type="dxa"/>
@@ -3586,12 +3558,6 @@
         </w:tc>
       </w:tr>
       <w:tr>
-        <w:tblPrEx>
-          <w:tblCellMar>
-            <w:top w:w="0" w:type="dxa"/>
-            <w:bottom w:w="0" w:type="dxa"/>
-          </w:tblCellMar>
-        </w:tblPrEx>
         <w:tc>
           <w:tcPr>
             <w:tcW w:w="600" w:type="dxa"/>
@@ -3742,12 +3708,6 @@
         </w:tc>
       </w:tr>
       <w:tr>
-        <w:tblPrEx>
-          <w:tblCellMar>
-            <w:top w:w="0" w:type="dxa"/>
-            <w:bottom w:w="0" w:type="dxa"/>
-          </w:tblCellMar>
-        </w:tblPrEx>
         <w:tc>
           <w:tcPr>
             <w:tcW w:w="600" w:type="dxa"/>
@@ -3898,12 +3858,6 @@
         </w:tc>
       </w:tr>
       <w:tr>
-        <w:tblPrEx>
-          <w:tblCellMar>
-            <w:top w:w="0" w:type="dxa"/>
-            <w:bottom w:w="0" w:type="dxa"/>
-          </w:tblCellMar>
-        </w:tblPrEx>
         <w:tc>
           <w:tcPr>
             <w:tcW w:w="600" w:type="dxa"/>
@@ -4054,12 +4008,6 @@
         </w:tc>
       </w:tr>
       <w:tr>
-        <w:tblPrEx>
-          <w:tblCellMar>
-            <w:top w:w="0" w:type="dxa"/>
-            <w:bottom w:w="0" w:type="dxa"/>
-          </w:tblCellMar>
-        </w:tblPrEx>
         <w:tc>
           <w:tcPr>
             <w:tcW w:w="600" w:type="dxa"/>
@@ -4331,6 +4279,84 @@
 <file path=word/numbering.xml><?xml version="1.0" encoding="utf-8"?>
 <w:numbering xmlns:wpc="http://schemas.microsoft.com/office/word/2010/wordprocessingCanvas" xmlns:cx="http://schemas.microsoft.com/office/drawing/2014/chartex" xmlns:cx1="http://schemas.microsoft.com/office/drawing/2015/9/8/chartex" xmlns:cx2="http://schemas.microsoft.com/office/drawing/2015/10/21/chartex" xmlns:cx3="http://schemas.microsoft.com/office/drawing/2016/5/9/chartex" xmlns:cx4="http://schemas.microsoft.com/office/drawing/2016/5/10/chartex" xmlns:cx5="http://schemas.microsoft.com/office/drawing/2016/5/11/chartex" xmlns:cx6="http://schemas.microsoft.com/office/drawing/2016/5/12/chartex" xmlns:cx7="http://schemas.microsoft.com/office/drawing/2016/5/13/chartex" xmlns:cx8="http://schemas.microsoft.com/office/drawing/2016/5/14/chartex" xmlns:mc="http://schemas.openxmlformats.org/markup-compatibility/2006" xmlns:aink="http://schemas.microsoft.com/office/drawing/2016/ink" xmlns:am3d="http://schemas.microsoft.com/office/drawing/2017/model3d" xmlns:o="urn:schemas-microsoft-com:office:office" xmlns:oel="http://schemas.microsoft.com/office/2019/extlst" xmlns:r="http://schemas.openxmlformats.org/officeDocument/2006/relationships" xmlns:m="http://schemas.openxmlformats.org/officeDocument/2006/math" xmlns:v="urn:schemas-microsoft-com:vml" xmlns:wp14="http://schemas.microsoft.com/office/word/2010/wordprocessingDrawing" xmlns:wp="http://schemas.openxmlformats.org/drawingml/2006/wordprocessingDrawing" xmlns:w10="urn:schemas-microsoft-com:office:word" xmlns:w="http://schemas.openxmlformats.org/wordprocessingml/2006/main" xmlns:w14="http://schemas.microsoft.com/office/word/2010/wordml" xmlns:w15="http://schemas.microsoft.com/office/word/2012/wordml" xmlns:w16cex="http://schemas.microsoft.com/office/word/2018/wordml/cex" xmlns:w16cid="http://schemas.microsoft.com/office/word/2016/wordml/cid" xmlns:w16="http://schemas.microsoft.com/office/word/2018/wordml" xmlns:w16du="http://schemas.microsoft.com/office/word/2023/wordml/word16du" xmlns:w16sdtdh="http://schemas.microsoft.com/office/word/2020/wordml/sdtdatahash" xmlns:w16sdtfl="http://schemas.microsoft.com/office/word/2024/wordml/sdtformatlock" xmlns:w16se="http://schemas.microsoft.com/office/word/2015/wordml/symex" xmlns:wpg="http://schemas.microsoft.com/office/word/2010/wordprocessingGroup" xmlns:wpi="http://schemas.microsoft.com/office/word/2010/wordprocessingInk" xmlns:wne="http://schemas.microsoft.com/office/word/2006/wordml" xmlns:wps="http://schemas.microsoft.com/office/word/2010/wordprocessingShape" mc:Ignorable="w14 w15 w16se w16cid w16 w16cex w16sdtdh w16sdtfl w16du wp14">
   <w:abstractNum w:abstractNumId="0" w15:restartNumberingAfterBreak="0">
+    <w:nsid w:val="1E7C2249"/>
+    <w:multiLevelType w:val="hybridMultilevel"/>
+    <w:tmpl w:val="FF669B80"/>
+    <w:lvl w:ilvl="0" w:tplc="2C76195C">
+      <w:start w:val="1"/>
+      <w:numFmt w:val="bullet"/>
+      <w:lvlText w:val="•"/>
+      <w:lvlJc w:val="left"/>
+      <w:pPr>
+        <w:ind w:left="720" w:hanging="360"/>
+      </w:pPr>
+    </w:lvl>
+    <w:lvl w:ilvl="1" w:tplc="49FA4906">
+      <w:numFmt w:val="decimal"/>
+      <w:lvlText w:val=""/>
+      <w:lvlJc w:val="left"/>
+      <w:pPr>
+        <w:ind w:left="0" w:firstLine="0"/>
+      </w:pPr>
+    </w:lvl>
+    <w:lvl w:ilvl="2" w:tplc="F45E7E36">
+      <w:numFmt w:val="decimal"/>
+      <w:lvlText w:val=""/>
+      <w:lvlJc w:val="left"/>
+      <w:pPr>
+        <w:ind w:left="0" w:firstLine="0"/>
+      </w:pPr>
+    </w:lvl>
+    <w:lvl w:ilvl="3" w:tplc="83A82CB8">
+      <w:numFmt w:val="decimal"/>
+      <w:lvlText w:val=""/>
+      <w:lvlJc w:val="left"/>
+      <w:pPr>
+        <w:ind w:left="0" w:firstLine="0"/>
+      </w:pPr>
+    </w:lvl>
+    <w:lvl w:ilvl="4" w:tplc="0B10B50E">
+      <w:numFmt w:val="decimal"/>
+      <w:lvlText w:val=""/>
+      <w:lvlJc w:val="left"/>
+      <w:pPr>
+        <w:ind w:left="0" w:firstLine="0"/>
+      </w:pPr>
+    </w:lvl>
+    <w:lvl w:ilvl="5" w:tplc="80B637C4">
+      <w:numFmt w:val="decimal"/>
+      <w:lvlText w:val=""/>
+      <w:lvlJc w:val="left"/>
+      <w:pPr>
+        <w:ind w:left="0" w:firstLine="0"/>
+      </w:pPr>
+    </w:lvl>
+    <w:lvl w:ilvl="6" w:tplc="CAD02DF0">
+      <w:numFmt w:val="decimal"/>
+      <w:lvlText w:val=""/>
+      <w:lvlJc w:val="left"/>
+      <w:pPr>
+        <w:ind w:left="0" w:firstLine="0"/>
+      </w:pPr>
+    </w:lvl>
+    <w:lvl w:ilvl="7" w:tplc="D27A4012">
+      <w:numFmt w:val="decimal"/>
+      <w:lvlText w:val=""/>
+      <w:lvlJc w:val="left"/>
+      <w:pPr>
+        <w:ind w:left="0" w:firstLine="0"/>
+      </w:pPr>
+    </w:lvl>
+    <w:lvl w:ilvl="8" w:tplc="5024099E">
+      <w:numFmt w:val="decimal"/>
+      <w:lvlText w:val=""/>
+      <w:lvlJc w:val="left"/>
+      <w:pPr>
+        <w:ind w:left="0" w:firstLine="0"/>
+      </w:pPr>
+    </w:lvl>
+  </w:abstractNum>
+  <w:abstractNum w:abstractNumId="1" w15:restartNumberingAfterBreak="0">
     <w:nsid w:val="319612C2"/>
     <w:multiLevelType w:val="hybridMultilevel"/>
     <w:tmpl w:val="CBBC8B56"/>
@@ -4416,7 +4442,7 @@
       </w:pPr>
     </w:lvl>
   </w:abstractNum>
-  <w:abstractNum w:abstractNumId="1" w15:restartNumberingAfterBreak="0">
+  <w:abstractNum w:abstractNumId="2" w15:restartNumberingAfterBreak="0">
     <w:nsid w:val="771B05F0"/>
     <w:multiLevelType w:val="hybridMultilevel"/>
     <w:tmpl w:val="CC86E7FC"/>
@@ -4471,16 +4497,19 @@
     </w:lvl>
   </w:abstractNum>
   <w:num w:numId="1" w16cid:durableId="1001354672">
-    <w:abstractNumId w:val="0"/>
+    <w:abstractNumId w:val="1"/>
     <w:lvlOverride w:ilvl="0">
       <w:startOverride w:val="1"/>
     </w:lvlOverride>
   </w:num>
   <w:num w:numId="2" w16cid:durableId="1080517472">
-    <w:abstractNumId w:val="1"/>
+    <w:abstractNumId w:val="2"/>
     <w:lvlOverride w:ilvl="0">
       <w:startOverride w:val="1"/>
     </w:lvlOverride>
+  </w:num>
+  <w:num w:numId="3" w16cid:durableId="1315447831">
+    <w:abstractNumId w:val="0"/>
   </w:num>
 </w:numbering>
 </file>

</xml_diff>